<commit_message>
Format publication figures with two-decimal labels
</commit_message>
<xml_diff>
--- a/report_remain_external_validation.docx
+++ b/report_remain_external_validation.docx
@@ -15,7 +15,7 @@
         <w:pStyle w:val="Date"/>
       </w:pPr>
       <w:r>
-        <w:t xml:space="preserve">2026-03-28</w:t>
+        <w:t xml:space="preserve">2026-04-27</w:t>
       </w:r>
     </w:p>
     <w:bookmarkStart w:id="22" w:name="methods"/>
@@ -455,7 +455,7 @@
         <w:t xml:space="preserve">Site-Level Validation Metrics</w:t>
       </w:r>
     </w:p>
-    <w:bookmarkStart w:id="24" w:name="T_6b66a"/>
+    <w:bookmarkStart w:id="24" w:name="T_c4648"/>
     <w:tbl>
       <w:tblPr>
         <w:tblStyle w:val="Table"/>
@@ -1005,7 +1005,7 @@
         <w:t xml:space="preserve">Random-Effects Meta-Analysis (Pooled External Validation)</w:t>
       </w:r>
     </w:p>
-    <w:bookmarkStart w:id="26" w:name="T_524b5"/>
+    <w:bookmarkStart w:id="26" w:name="T_7e13f"/>
     <w:tbl>
       <w:tblPr>
         <w:tblStyle w:val="Table"/>
@@ -1277,7 +1277,7 @@
       <w:r>
         <w:drawing>
           <wp:inline>
-            <wp:extent cx="5943600" cy="4636008"/>
+            <wp:extent cx="5943600" cy="4953000"/>
             <wp:effectExtent b="0" l="0" r="0" t="0"/>
             <wp:docPr descr="Receiver operating characteristics curves for in-hospital mortality using the REMAIN model" title="" id="28" name="Picture"/>
             <a:graphic>
@@ -1298,7 +1298,7 @@
                   <pic:spPr bwMode="auto">
                     <a:xfrm>
                       <a:off x="0" y="0"/>
-                      <a:ext cx="5943600" cy="4636008"/>
+                      <a:ext cx="5943600" cy="4953000"/>
                     </a:xfrm>
                     <a:prstGeom prst="rect">
                       <a:avLst/>
@@ -1437,7 +1437,7 @@
     </w:p>
     <w:bookmarkEnd w:id="36"/>
     <w:bookmarkEnd w:id="37"/>
-    <w:bookmarkStart w:id="69" w:name="X91ad81bb3f8b7ee7501f0ea31576a5f3268f5f3"/>
+    <w:bookmarkStart w:id="77" w:name="X91ad81bb3f8b7ee7501f0ea31576a5f3268f5f3"/>
     <w:p>
       <w:pPr>
         <w:pStyle w:val="Heading2"/>
@@ -1518,7 +1518,7 @@
         <w:t xml:space="preserve">Site-Level Holdout Results</w:t>
       </w:r>
     </w:p>
-    <w:bookmarkStart w:id="38" w:name="T_8d1eb"/>
+    <w:bookmarkStart w:id="38" w:name="T_cf253"/>
     <w:tbl>
       <w:tblPr>
         <w:tblStyle w:val="Table"/>
@@ -5312,7 +5312,7 @@
         <w:t xml:space="preserve">Random-Effects Meta-Analysis (Pooled Across Sites)</w:t>
       </w:r>
     </w:p>
-    <w:bookmarkStart w:id="40" w:name="T_090ee"/>
+    <w:bookmarkStart w:id="40" w:name="T_b0728"/>
     <w:tbl>
       <w:tblPr>
         <w:tblStyle w:val="Table"/>
@@ -6012,88 +6012,37 @@
       </w:tr>
     </w:tbl>
     <w:bookmarkEnd w:id="40"/>
+    <w:bookmarkEnd w:id="41"/>
+    <w:bookmarkStart w:id="45" w:name="roc-auc-forest-plot-across-sites"/>
     <w:p>
       <w:pPr>
-        <w:pStyle w:val="BodyText"/>
-      </w:pPr>
-      <w:r>
-        <w:t xml:space="preserve">Note: Prediction intervals in this internal-external validation context should not be directly compared to the pooled results for REMAIN external validation, as predictions for each hold-out site are from different models trained on data from each other site.</w:t>
-      </w:r>
-    </w:p>
-    <w:bookmarkEnd w:id="41"/>
-    <w:bookmarkStart w:id="42" w:name="interpretation-1"/>
-    <w:p>
-      <w:pPr>
         <w:pStyle w:val="Heading3"/>
       </w:pPr>
       <w:r>
-        <w:t xml:space="preserve">Interpretation</w:t>
+        <w:t xml:space="preserve">ROC-AUC Forest Plot Across Sites</w:t>
       </w:r>
     </w:p>
     <w:p>
       <w:pPr>
-        <w:numPr>
-          <w:ilvl w:val="0"/>
-          <w:numId w:val="1005"/>
-        </w:numPr>
-      </w:pPr>
-      <w:r>
-        <w:t xml:space="preserve">TabICL resulted in the numerically highest pooled ROC-AUC. Additionally, the 95% prediction interval for TabICL were the most narrow across the models that were evaluated due to considerably less heterogeneity across sites. Inspection of measures to assess calibration also indicated that TabICL had the most consistent calibration across sites, with CITL values closest to 0 and slope values closest to 1 across sites.</w:t>
-      </w:r>
-    </w:p>
-    <w:p>
-      <w:pPr>
-        <w:numPr>
-          <w:ilvl w:val="0"/>
-          <w:numId w:val="1005"/>
-        </w:numPr>
-      </w:pPr>
-      <w:r>
-        <w:t xml:space="preserve">Developing a new model to predict in-hospital mortality after MET review using an internal-external validation approach, which allowed for training on data from multiple sites, did not substantially improve calibration compared to the REMAIN logistic regression model.</w:t>
-      </w:r>
-    </w:p>
-    <w:p>
-      <w:pPr>
-        <w:numPr>
-          <w:ilvl w:val="0"/>
-          <w:numId w:val="1005"/>
-        </w:numPr>
-      </w:pPr>
-      <w:r>
-        <w:t xml:space="preserve">On balance, given similar estimates of calibration, the TabICL model may be preferred given its slightly higher and more consistent performance in discrimination across sites.</w:t>
-      </w:r>
-    </w:p>
-    <w:bookmarkEnd w:id="42"/>
-    <w:bookmarkStart w:id="52" w:name="X04abea635892eafe931111c8e2e68eab73f6e42"/>
-    <w:p>
-      <w:pPr>
-        <w:pStyle w:val="Heading3"/>
-      </w:pPr>
-      <w:r>
-        <w:t xml:space="preserve">TabICL With Expanded Feature Set Holdout-Site Plots (Internal-External)</w:t>
-      </w:r>
-    </w:p>
-    <w:p>
-      <w:pPr>
         <w:pStyle w:val="CaptionedFigure"/>
       </w:pPr>
       <w:r>
         <w:drawing>
           <wp:inline>
-            <wp:extent cx="5943600" cy="3637035"/>
+            <wp:extent cx="5943600" cy="5295207"/>
             <wp:effectExtent b="0" l="0" r="0" t="0"/>
-            <wp:docPr descr="Receiver operating characteristics curves for in-hospital mortality using the TabICL model with expanded feature set" title="" id="44" name="Picture"/>
+            <wp:docPr descr="Forest plot of site-specific and pooled ROC-AUC estimates from internal-external validation. Abbreviations: ROC-AUC, area under the receiver operating characteristic curve; CI, confidence interval; PI, prediction interval; Tau2, between-site variance on the logit(AUC) scale; I2, inconsistency statistic." title="" id="43" name="Picture"/>
             <a:graphic>
               <a:graphicData uri="http://schemas.openxmlformats.org/drawingml/2006/picture">
                 <pic:pic>
                   <pic:nvPicPr>
-                    <pic:cNvPr descr="report_remain_external_validation_files/figure-docx/cell-10-output-1.png" id="45" name="Picture"/>
+                    <pic:cNvPr descr="report_remain_external_validation_files/figure-docx/cell-11-output-1.png" id="44" name="Picture"/>
                     <pic:cNvPicPr>
                       <a:picLocks noChangeArrowheads="1" noChangeAspect="1"/>
                     </pic:cNvPicPr>
                   </pic:nvPicPr>
                   <pic:blipFill>
-                    <a:blip r:embed="rId43"/>
+                    <a:blip r:embed="rId42"/>
                     <a:stretch>
                       <a:fillRect/>
                     </a:stretch>
@@ -6101,7 +6050,7 @@
                   <pic:spPr bwMode="auto">
                     <a:xfrm>
                       <a:off x="0" y="0"/>
-                      <a:ext cx="5943600" cy="3637035"/>
+                      <a:ext cx="5943600" cy="5295207"/>
                     </a:xfrm>
                     <a:prstGeom prst="rect">
                       <a:avLst/>
@@ -6125,24 +6074,60 @@
         <w:pStyle w:val="ImageCaption"/>
       </w:pPr>
       <w:r>
-        <w:t xml:space="preserve">Receiver operating characteristics curves for in-hospital mortality using the TabICL model with expanded feature set</w:t>
+        <w:t xml:space="preserve">Forest plot of site-specific and pooled ROC-AUC estimates from internal-external validation. Abbreviations: ROC-AUC, area under the receiver operating characteristic curve; CI, confidence interval; PI, prediction interval; Tau</w:t>
+      </w:r>
+      <w:r>
+        <w:rPr>
+          <w:vertAlign w:val="superscript"/>
+        </w:rPr>
+        <w:t xml:space="preserve">2</w:t>
+      </w:r>
+      <w:r>
+        <w:t xml:space="preserve">, between-site variance on the logit(AUC) scale; I</w:t>
+      </w:r>
+      <w:r>
+        <w:rPr>
+          <w:vertAlign w:val="superscript"/>
+        </w:rPr>
+        <w:t xml:space="preserve">2</w:t>
+      </w:r>
+      <w:r>
+        <w:t xml:space="preserve">, inconsistency statistic.</w:t>
       </w:r>
     </w:p>
     <w:p>
       <w:pPr>
+        <w:pStyle w:val="BodyText"/>
+      </w:pPr>
+      <w:r>
+        <w:t xml:space="preserve">Note: Site-specific confidence intervals were derived from the Hanley-McNeil standard error on the logit(AUC) scale. Weight (%) denotes the random-effects weight contributed by each site on the logit(AUC) scale. Pooled estimates, 95% confidence intervals, and prediction intervals were taken from the random-effects meta-analysis across the four sites.</w:t>
+      </w:r>
+    </w:p>
+    <w:bookmarkEnd w:id="45"/>
+    <w:bookmarkStart w:id="49" w:name="tabicl-versus-news-logistic"/>
+    <w:p>
+      <w:pPr>
+        <w:pStyle w:val="Heading3"/>
+      </w:pPr>
+      <w:r>
+        <w:t xml:space="preserve">TabICL Versus NEWS Logistic</w:t>
+      </w:r>
+    </w:p>
+    <w:p>
+      <w:pPr>
         <w:pStyle w:val="CaptionedFigure"/>
       </w:pPr>
       <w:r>
         <w:drawing>
           <wp:inline>
-            <wp:extent cx="5943600" cy="4330019"/>
+            <wp:extent cx="5943600" cy="2588085"/>
             <wp:effectExtent b="0" l="0" r="0" t="0"/>
-            <wp:docPr descr="Precision-recall curves for in-hospital mortality using the TabICL model with expanded feature set" title="" id="47" name="Picture"/>
+            <wp:docPr descr="Receiver operating characteristic and calibration plots comparing the TabICL model with expanded feature set and NEWS logistic, using concatenated out-of-site predictions across all held-out sites from internal-external validation" title="" id="47" name="Picture"/>
             <a:graphic>
               <a:graphicData uri="http://schemas.openxmlformats.org/drawingml/2006/picture">
                 <pic:pic>
                   <pic:nvPicPr>
-                    <pic:cNvPr descr="report_remain_external_validation_files/figure-docx/cell-11-output-1.png" id="48" name="Picture"/>
+                    <pic:cNvPr descr="report_remain_external_validation_files/figure-docx/cell-12-output-1.png" id="48" name="Picture"/>
                     <pic:cNvPicPr>
                       <a:picLocks noChangeArrowheads="1" noChangeAspect="1"/>
                     </pic:cNvPicPr>
@@ -6156,7 +6141,7 @@
                   <pic:spPr bwMode="auto">
                     <a:xfrm>
                       <a:off x="0" y="0"/>
-                      <a:ext cx="5943600" cy="4330019"/>
+                      <a:ext cx="5943600" cy="2588085"/>
                     </a:xfrm>
                     <a:prstGeom prst="rect">
                       <a:avLst/>
@@ -6180,30 +6165,91 @@
         <w:pStyle w:val="ImageCaption"/>
       </w:pPr>
       <w:r>
-        <w:t xml:space="preserve">Precision-recall curves for in-hospital mortality using the TabICL model with expanded feature set</w:t>
+        <w:t xml:space="preserve">Receiver operating characteristic and calibration plots comparing the TabICL model with expanded feature set and NEWS logistic, using concatenated out-of-site predictions across all held-out sites from internal-external validation</w:t>
       </w:r>
     </w:p>
     <w:p>
       <w:pPr>
+        <w:pStyle w:val="BodyText"/>
+      </w:pPr>
+      <w:r>
+        <w:t xml:space="preserve">Note: For each model, predictions from all held-out sites were concatenated so that each curve reflects pooled out-of-site performance across the full internal-external validation dataset.</w:t>
+      </w:r>
+    </w:p>
+    <w:bookmarkEnd w:id="49"/>
+    <w:bookmarkStart w:id="50" w:name="interpretation-1"/>
+    <w:p>
+      <w:pPr>
+        <w:pStyle w:val="Heading3"/>
+      </w:pPr>
+      <w:r>
+        <w:t xml:space="preserve">Interpretation</w:t>
+      </w:r>
+    </w:p>
+    <w:p>
+      <w:pPr>
+        <w:numPr>
+          <w:ilvl w:val="0"/>
+          <w:numId w:val="1005"/>
+        </w:numPr>
+      </w:pPr>
+      <w:r>
+        <w:t xml:space="preserve">TabICL resulted in the numerically highest pooled ROC-AUC. Additionally, the 95% prediction interval for TabICL were the most narrow across the models that were evaluated due to considerably less heterogeneity across sites. Inspection of measures to assess calibration also indicated that TabICL had the most consistent calibration across sites, with CITL values closest to 0 and slope values closest to 1 across sites.</w:t>
+      </w:r>
+    </w:p>
+    <w:p>
+      <w:pPr>
+        <w:numPr>
+          <w:ilvl w:val="0"/>
+          <w:numId w:val="1005"/>
+        </w:numPr>
+      </w:pPr>
+      <w:r>
+        <w:t xml:space="preserve">Developing a new model to predict in-hospital mortality after MET review using an internal-external validation approach, which allowed for training on data from multiple sites, did not substantially improve calibration compared to the REMAIN logistic regression model.</w:t>
+      </w:r>
+    </w:p>
+    <w:p>
+      <w:pPr>
+        <w:numPr>
+          <w:ilvl w:val="0"/>
+          <w:numId w:val="1005"/>
+        </w:numPr>
+      </w:pPr>
+      <w:r>
+        <w:t xml:space="preserve">On balance, given similar estimates of calibration, the TabICL model may be preferred given its slightly higher and more consistent performance in discrimination across sites.</w:t>
+      </w:r>
+    </w:p>
+    <w:bookmarkEnd w:id="50"/>
+    <w:bookmarkStart w:id="60" w:name="X04abea635892eafe931111c8e2e68eab73f6e42"/>
+    <w:p>
+      <w:pPr>
+        <w:pStyle w:val="Heading3"/>
+      </w:pPr>
+      <w:r>
+        <w:t xml:space="preserve">TabICL With Expanded Feature Set Holdout-Site Plots (Internal-External)</w:t>
+      </w:r>
+    </w:p>
+    <w:p>
+      <w:pPr>
         <w:pStyle w:val="CaptionedFigure"/>
       </w:pPr>
       <w:r>
         <w:drawing>
           <wp:inline>
-            <wp:extent cx="5943600" cy="4754880"/>
+            <wp:extent cx="5943600" cy="3978267"/>
             <wp:effectExtent b="0" l="0" r="0" t="0"/>
-            <wp:docPr descr="Calibration plots for in-hospital mortality using the TabICL model with expanded feature set" title="" id="50" name="Picture"/>
+            <wp:docPr descr="Receiver operating characteristics curves for in-hospital mortality using the TabICL model with expanded feature set" title="" id="52" name="Picture"/>
             <a:graphic>
               <a:graphicData uri="http://schemas.openxmlformats.org/drawingml/2006/picture">
                 <pic:pic>
                   <pic:nvPicPr>
-                    <pic:cNvPr descr="report_remain_external_validation_files/figure-docx/cell-12-output-1.png" id="51" name="Picture"/>
+                    <pic:cNvPr descr="report_remain_external_validation_files/figure-docx/cell-13-output-1.png" id="53" name="Picture"/>
                     <pic:cNvPicPr>
                       <a:picLocks noChangeArrowheads="1" noChangeAspect="1"/>
                     </pic:cNvPicPr>
                   </pic:nvPicPr>
                   <pic:blipFill>
-                    <a:blip r:embed="rId49"/>
+                    <a:blip r:embed="rId51"/>
                     <a:stretch>
                       <a:fillRect/>
                     </a:stretch>
@@ -6211,7 +6257,7 @@
                   <pic:spPr bwMode="auto">
                     <a:xfrm>
                       <a:off x="0" y="0"/>
-                      <a:ext cx="5943600" cy="4754880"/>
+                      <a:ext cx="5943600" cy="3978267"/>
                     </a:xfrm>
                     <a:prstGeom prst="rect">
                       <a:avLst/>
@@ -6235,17 +6281,7 @@
         <w:pStyle w:val="ImageCaption"/>
       </w:pPr>
       <w:r>
-        <w:t xml:space="preserve">Calibration plots for in-hospital mortality using the TabICL model with expanded feature set</w:t>
-      </w:r>
-    </w:p>
-    <w:bookmarkEnd w:id="52"/>
-    <w:bookmarkStart w:id="68" w:name="X471fffe24d013dfb0f27a7a102d85432f9a1b83"/>
-    <w:p>
-      <w:pPr>
-        <w:pStyle w:val="Heading3"/>
-      </w:pPr>
-      <w:r>
-        <w:t xml:space="preserve">Group Ridge Holdout-Site Plots (Internal-External)</w:t>
+        <w:t xml:space="preserve">Receiver operating characteristics curves for in-hospital mortality using the TabICL model with expanded feature set</w:t>
       </w:r>
     </w:p>
     <w:p>
@@ -6255,20 +6291,20 @@
       <w:r>
         <w:drawing>
           <wp:inline>
-            <wp:extent cx="5943600" cy="4440620"/>
+            <wp:extent cx="5943600" cy="4737065"/>
             <wp:effectExtent b="0" l="0" r="0" t="0"/>
-            <wp:docPr descr="Receiver operating characteristics curves for in-hospital mortality using the Group ridge model" title="" id="54" name="Picture"/>
+            <wp:docPr descr="Precision-recall curves for in-hospital mortality using the TabICL model with expanded feature set" title="" id="55" name="Picture"/>
             <a:graphic>
               <a:graphicData uri="http://schemas.openxmlformats.org/drawingml/2006/picture">
                 <pic:pic>
                   <pic:nvPicPr>
-                    <pic:cNvPr descr="report_remain_external_validation_files/figure-docx/cell-13-output-1.png" id="55" name="Picture"/>
+                    <pic:cNvPr descr="report_remain_external_validation_files/figure-docx/cell-14-output-1.png" id="56" name="Picture"/>
                     <pic:cNvPicPr>
                       <a:picLocks noChangeArrowheads="1" noChangeAspect="1"/>
                     </pic:cNvPicPr>
                   </pic:nvPicPr>
                   <pic:blipFill>
-                    <a:blip r:embed="rId53"/>
+                    <a:blip r:embed="rId54"/>
                     <a:stretch>
                       <a:fillRect/>
                     </a:stretch>
@@ -6276,7 +6312,7 @@
                   <pic:spPr bwMode="auto">
                     <a:xfrm>
                       <a:off x="0" y="0"/>
-                      <a:ext cx="5943600" cy="4440620"/>
+                      <a:ext cx="5943600" cy="4737065"/>
                     </a:xfrm>
                     <a:prstGeom prst="rect">
                       <a:avLst/>
@@ -6300,7 +6336,7 @@
         <w:pStyle w:val="ImageCaption"/>
       </w:pPr>
       <w:r>
-        <w:t xml:space="preserve">Receiver operating characteristics curves for in-hospital mortality using the Group ridge model</w:t>
+        <w:t xml:space="preserve">Precision-recall curves for in-hospital mortality using the TabICL model with expanded feature set</w:t>
       </w:r>
     </w:p>
     <w:p>
@@ -6310,20 +6346,140 @@
       <w:r>
         <w:drawing>
           <wp:inline>
-            <wp:extent cx="5943600" cy="5105735"/>
+            <wp:extent cx="5943600" cy="5099338"/>
             <wp:effectExtent b="0" l="0" r="0" t="0"/>
-            <wp:docPr descr="Precision-recall curves for in-hospital mortality using the Group ridge model" title="" id="57" name="Picture"/>
+            <wp:docPr descr="Calibration plots for in-hospital mortality using the TabICL model with expanded feature set" title="" id="58" name="Picture"/>
             <a:graphic>
               <a:graphicData uri="http://schemas.openxmlformats.org/drawingml/2006/picture">
                 <pic:pic>
                   <pic:nvPicPr>
-                    <pic:cNvPr descr="report_remain_external_validation_files/figure-docx/cell-14-output-1.png" id="58" name="Picture"/>
+                    <pic:cNvPr descr="report_remain_external_validation_files/figure-docx/cell-15-output-1.png" id="59" name="Picture"/>
                     <pic:cNvPicPr>
                       <a:picLocks noChangeArrowheads="1" noChangeAspect="1"/>
                     </pic:cNvPicPr>
                   </pic:nvPicPr>
                   <pic:blipFill>
-                    <a:blip r:embed="rId56"/>
+                    <a:blip r:embed="rId57"/>
+                    <a:stretch>
+                      <a:fillRect/>
+                    </a:stretch>
+                  </pic:blipFill>
+                  <pic:spPr bwMode="auto">
+                    <a:xfrm>
+                      <a:off x="0" y="0"/>
+                      <a:ext cx="5943600" cy="5099338"/>
+                    </a:xfrm>
+                    <a:prstGeom prst="rect">
+                      <a:avLst/>
+                    </a:prstGeom>
+                    <a:noFill/>
+                    <a:ln w="9525">
+                      <a:noFill/>
+                      <a:headEnd/>
+                      <a:tailEnd/>
+                    </a:ln>
+                  </pic:spPr>
+                </pic:pic>
+              </a:graphicData>
+            </a:graphic>
+          </wp:inline>
+        </w:drawing>
+      </w:r>
+    </w:p>
+    <w:p>
+      <w:pPr>
+        <w:pStyle w:val="ImageCaption"/>
+      </w:pPr>
+      <w:r>
+        <w:t xml:space="preserve">Calibration plots for in-hospital mortality using the TabICL model with expanded feature set</w:t>
+      </w:r>
+    </w:p>
+    <w:bookmarkEnd w:id="60"/>
+    <w:bookmarkStart w:id="76" w:name="X471fffe24d013dfb0f27a7a102d85432f9a1b83"/>
+    <w:p>
+      <w:pPr>
+        <w:pStyle w:val="Heading3"/>
+      </w:pPr>
+      <w:r>
+        <w:t xml:space="preserve">Group Ridge Holdout-Site Plots (Internal-External)</w:t>
+      </w:r>
+    </w:p>
+    <w:p>
+      <w:pPr>
+        <w:pStyle w:val="CaptionedFigure"/>
+      </w:pPr>
+      <w:r>
+        <w:drawing>
+          <wp:inline>
+            <wp:extent cx="5943600" cy="4849380"/>
+            <wp:effectExtent b="0" l="0" r="0" t="0"/>
+            <wp:docPr descr="Receiver operating characteristics curves for in-hospital mortality using the Group ridge model" title="" id="62" name="Picture"/>
+            <a:graphic>
+              <a:graphicData uri="http://schemas.openxmlformats.org/drawingml/2006/picture">
+                <pic:pic>
+                  <pic:nvPicPr>
+                    <pic:cNvPr descr="report_remain_external_validation_files/figure-docx/cell-16-output-1.png" id="63" name="Picture"/>
+                    <pic:cNvPicPr>
+                      <a:picLocks noChangeArrowheads="1" noChangeAspect="1"/>
+                    </pic:cNvPicPr>
+                  </pic:nvPicPr>
+                  <pic:blipFill>
+                    <a:blip r:embed="rId61"/>
+                    <a:stretch>
+                      <a:fillRect/>
+                    </a:stretch>
+                  </pic:blipFill>
+                  <pic:spPr bwMode="auto">
+                    <a:xfrm>
+                      <a:off x="0" y="0"/>
+                      <a:ext cx="5943600" cy="4849380"/>
+                    </a:xfrm>
+                    <a:prstGeom prst="rect">
+                      <a:avLst/>
+                    </a:prstGeom>
+                    <a:noFill/>
+                    <a:ln w="9525">
+                      <a:noFill/>
+                      <a:headEnd/>
+                      <a:tailEnd/>
+                    </a:ln>
+                  </pic:spPr>
+                </pic:pic>
+              </a:graphicData>
+            </a:graphic>
+          </wp:inline>
+        </w:drawing>
+      </w:r>
+    </w:p>
+    <w:p>
+      <w:pPr>
+        <w:pStyle w:val="ImageCaption"/>
+      </w:pPr>
+      <w:r>
+        <w:t xml:space="preserve">Receiver operating characteristics curves for in-hospital mortality using the Group ridge model</w:t>
+      </w:r>
+    </w:p>
+    <w:p>
+      <w:pPr>
+        <w:pStyle w:val="CaptionedFigure"/>
+      </w:pPr>
+      <w:r>
+        <w:drawing>
+          <wp:inline>
+            <wp:extent cx="5943600" cy="5105735"/>
+            <wp:effectExtent b="0" l="0" r="0" t="0"/>
+            <wp:docPr descr="Precision-recall curves for in-hospital mortality using the Group ridge model" title="" id="65" name="Picture"/>
+            <a:graphic>
+              <a:graphicData uri="http://schemas.openxmlformats.org/drawingml/2006/picture">
+                <pic:pic>
+                  <pic:nvPicPr>
+                    <pic:cNvPr descr="report_remain_external_validation_files/figure-docx/cell-17-output-1.png" id="66" name="Picture"/>
+                    <pic:cNvPicPr>
+                      <a:picLocks noChangeArrowheads="1" noChangeAspect="1"/>
+                    </pic:cNvPicPr>
+                  </pic:nvPicPr>
+                  <pic:blipFill>
+                    <a:blip r:embed="rId64"/>
                     <a:stretch>
                       <a:fillRect/>
                     </a:stretch>
@@ -6367,18 +6523,18 @@
           <wp:inline>
             <wp:extent cx="5943600" cy="5271562"/>
             <wp:effectExtent b="0" l="0" r="0" t="0"/>
-            <wp:docPr descr="Calibration plots for in-hospital mortality using the Group ridge model" title="" id="60" name="Picture"/>
+            <wp:docPr descr="Calibration plots for in-hospital mortality using the Group ridge model" title="" id="68" name="Picture"/>
             <a:graphic>
               <a:graphicData uri="http://schemas.openxmlformats.org/drawingml/2006/picture">
                 <pic:pic>
                   <pic:nvPicPr>
-                    <pic:cNvPr descr="report_remain_external_validation_files/figure-docx/cell-15-output-1.png" id="61" name="Picture"/>
+                    <pic:cNvPr descr="report_remain_external_validation_files/figure-docx/cell-18-output-1.png" id="69" name="Picture"/>
                     <pic:cNvPicPr>
                       <a:picLocks noChangeArrowheads="1" noChangeAspect="1"/>
                     </pic:cNvPicPr>
                   </pic:nvPicPr>
                   <pic:blipFill>
-                    <a:blip r:embed="rId59"/>
+                    <a:blip r:embed="rId67"/>
                     <a:stretch>
                       <a:fillRect/>
                     </a:stretch>
@@ -6413,8 +6569,8 @@
         <w:t xml:space="preserve">Calibration plots for in-hospital mortality using the Group ridge model</w:t>
       </w:r>
     </w:p>
-    <w:bookmarkStart w:id="67" w:name="refs"/>
-    <w:bookmarkStart w:id="63" w:name="Xdc139a13097d54b8850db3499be2f88bd5ecf9b"/>
+    <w:bookmarkStart w:id="75" w:name="refs"/>
+    <w:bookmarkStart w:id="71" w:name="Xdc139a13097d54b8850db3499be2f88bd5ecf9b"/>
     <w:p>
       <w:pPr>
         <w:pStyle w:val="Bibliography"/>
@@ -6431,7 +6587,7 @@
       <w:r>
         <w:t xml:space="preserve"> </w:t>
       </w:r>
-      <w:hyperlink r:id="rId62">
+      <w:hyperlink r:id="rId70">
         <w:r>
           <w:rPr>
             <w:rStyle w:val="Hyperlink"/>
@@ -6443,8 +6599,8 @@
         <w:t xml:space="preserve">.</w:t>
       </w:r>
     </w:p>
-    <w:bookmarkEnd w:id="63"/>
-    <w:bookmarkStart w:id="65" w:name="ref-qu2026tabiclv2betterfasterscalable"/>
+    <w:bookmarkEnd w:id="71"/>
+    <w:bookmarkStart w:id="73" w:name="ref-qu2026tabiclv2betterfasterscalable"/>
     <w:p>
       <w:pPr>
         <w:pStyle w:val="Bibliography"/>
@@ -6461,7 +6617,7 @@
       <w:r>
         <w:t xml:space="preserve"> </w:t>
       </w:r>
-      <w:hyperlink r:id="rId64">
+      <w:hyperlink r:id="rId72">
         <w:r>
           <w:rPr>
             <w:rStyle w:val="Hyperlink"/>
@@ -6473,8 +6629,8 @@
         <w:t xml:space="preserve">.</w:t>
       </w:r>
     </w:p>
-    <w:bookmarkEnd w:id="65"/>
-    <w:bookmarkStart w:id="66" w:name="ref-yuan2006model"/>
+    <w:bookmarkEnd w:id="73"/>
+    <w:bookmarkStart w:id="74" w:name="ref-yuan2006model"/>
     <w:p>
       <w:pPr>
         <w:pStyle w:val="Bibliography"/>
@@ -6505,10 +6661,10 @@
         <w:t xml:space="preserve">68 (1): 49–67.</w:t>
       </w:r>
     </w:p>
-    <w:bookmarkEnd w:id="66"/>
-    <w:bookmarkEnd w:id="67"/>
-    <w:bookmarkEnd w:id="68"/>
-    <w:bookmarkEnd w:id="69"/>
+    <w:bookmarkEnd w:id="74"/>
+    <w:bookmarkEnd w:id="75"/>
+    <w:bookmarkEnd w:id="76"/>
+    <w:bookmarkEnd w:id="77"/>
     <w:sectPr>
       <w:pgSz w:h="15840" w:w="12240"/>
       <w:pgMar w:bottom="1440" w:footer="720" w:gutter="0" w:header="720" w:left="1440" w:right="1440" w:top="1440"/>

</xml_diff>